<commit_message>
legal: add full Ozon Bank requisites to card and universal public offer
</commit_message>
<xml_diff>
--- a/baza/исходник миникурса/КАРТОЧКА_РЕКВИЗИТОВ_ФЕДОРОВ.docx
+++ b/baza/исходник миникурса/КАРТОЧКА_РЕКВИЗИТОВ_ФЕДОРОВ.docx
@@ -4,7 +4,6 @@
   <w:body>
     <w:p>
       <w:pPr>
-        <w:spacing w:after="40"/>
         <w:jc w:val="center"/>
       </w:pPr>
       <w:r>
@@ -14,27 +13,12 @@
           <w:color w:val="1F4E5B"/>
           <w:sz w:val="32"/>
         </w:rPr>
-        <w:t>КАРТОЧКА ОФИЦИАЛЬНЫХ РЕКВИЗИТОВ ИСПОЛНИТЕЛЯ</w:t>
+        <w:t>КАРТОЧКА ОФИЦИАЛЬНЫХ И БАНКОВСКИХ РЕКВИЗИТОВ</w:t>
       </w:r>
     </w:p>
     <w:p>
       <w:pPr>
-        <w:spacing w:after="280"/>
-        <w:jc w:val="center"/>
-      </w:pPr>
-      <w:r>
-        <w:rPr>
-          <w:rFonts w:ascii="Calibri" w:hAnsi="Calibri"/>
-          <w:i/>
-          <w:color w:val="555555"/>
-          <w:sz w:val="21"/>
-        </w:rPr>
-        <w:t>Для размещения на сайтах, в Telegram-ботах, платежных шлюзах и договорах</w:t>
-      </w:r>
-    </w:p>
-    <w:p>
-      <w:pPr>
-        <w:spacing w:before="200" w:after="40"/>
+        <w:spacing w:before="220" w:after="40"/>
       </w:pPr>
       <w:r>
         <w:rPr>
@@ -43,7 +27,7 @@
           <w:color w:val="1F4E5B"/>
           <w:sz w:val="24"/>
         </w:rPr>
-        <w:t>1. ОСНОВНЫЕ РЕКВИЗИТЫ</w:t>
+        <w:t>1. СВЕДЕНИЯ ОБ ИСПОЛНИТЕЛЕ</w:t>
       </w:r>
     </w:p>
     <w:p>
@@ -62,7 +46,6 @@
       <w:r>
         <w:rPr>
           <w:rFonts w:ascii="Calibri" w:hAnsi="Calibri"/>
-          <w:color w:val="222222"/>
           <w:sz w:val="21"/>
         </w:rPr>
         <w:t>Федоров Анатолий Игоревич</w:t>
@@ -84,7 +67,6 @@
       <w:r>
         <w:rPr>
           <w:rFonts w:ascii="Calibri" w:hAnsi="Calibri"/>
-          <w:color w:val="222222"/>
           <w:sz w:val="21"/>
         </w:rPr>
         <w:t>Физическое лицо, применяющее специальный налоговый режим «Налог на профессиональный доход» (самозанятый)</w:t>
@@ -101,12 +83,11 @@
           <w:color w:val="1F4E5B"/>
           <w:sz w:val="21"/>
         </w:rPr>
-        <w:t xml:space="preserve">ИНН: </w:t>
+        <w:t xml:space="preserve">ИНН плательщика: </w:t>
       </w:r>
       <w:r>
         <w:rPr>
           <w:rFonts w:ascii="Calibri" w:hAnsi="Calibri"/>
-          <w:color w:val="222222"/>
           <w:sz w:val="21"/>
         </w:rPr>
         <w:t>164803784216</w:t>
@@ -123,15 +104,28 @@
           <w:color w:val="1F4E5B"/>
           <w:sz w:val="21"/>
         </w:rPr>
-        <w:t xml:space="preserve">Налоговый орган: </w:t>
+        <w:t xml:space="preserve">Законодательное основание: </w:t>
       </w:r>
       <w:r>
         <w:rPr>
           <w:rFonts w:ascii="Calibri" w:hAnsi="Calibri"/>
-          <w:color w:val="222222"/>
           <w:sz w:val="21"/>
         </w:rPr>
-        <w:t>Управление ФНС по Республике Татарстан / г. Москва</w:t>
+        <w:t>Федеральный закон от 27.11.2018 № 422-ФЗ</w:t>
+      </w:r>
+    </w:p>
+    <w:p>
+      <w:pPr>
+        <w:spacing w:before="220" w:after="40"/>
+      </w:pPr>
+      <w:r>
+        <w:rPr>
+          <w:rFonts w:ascii="Calibri" w:hAnsi="Calibri"/>
+          <w:b/>
+          <w:color w:val="1F4E5B"/>
+          <w:sz w:val="24"/>
+        </w:rPr>
+        <w:t>2. БАНКОВСКИЕ РЕКВИЗИТЫ ДЛЯ ПЛАТЕЖЕЙ И ДОГОВОРОВ</w:t>
       </w:r>
     </w:p>
     <w:p>
@@ -145,29 +139,14 @@
           <w:color w:val="1F4E5B"/>
           <w:sz w:val="21"/>
         </w:rPr>
-        <w:t xml:space="preserve">Законодательная база: </w:t>
+        <w:t xml:space="preserve">Получатель платежа: </w:t>
       </w:r>
       <w:r>
         <w:rPr>
           <w:rFonts w:ascii="Calibri" w:hAnsi="Calibri"/>
-          <w:color w:val="222222"/>
           <w:sz w:val="21"/>
         </w:rPr>
-        <w:t>Федеральный закон от 27.11.2018 № 422-ФЗ</w:t>
-      </w:r>
-    </w:p>
-    <w:p>
-      <w:pPr>
-        <w:spacing w:before="200" w:after="40"/>
-      </w:pPr>
-      <w:r>
-        <w:rPr>
-          <w:rFonts w:ascii="Calibri" w:hAnsi="Calibri"/>
-          <w:b/>
-          <w:color w:val="1F4E5B"/>
-          <w:sz w:val="24"/>
-        </w:rPr>
-        <w:t>2. КОНТАКТНЫЕ ДАННЫЕ ДЛЯ ОБРАЩЕНИЙ И ПРЕТЕНЗИЙ</w:t>
+        <w:t>Федоров Анатолий Игоревич</w:t>
       </w:r>
     </w:p>
     <w:p>
@@ -181,12 +160,151 @@
           <w:color w:val="1F4E5B"/>
           <w:sz w:val="21"/>
         </w:rPr>
-        <w:t xml:space="preserve">E-mail официальный: </w:t>
+        <w:t xml:space="preserve">Номер счёта получателя: </w:t>
       </w:r>
       <w:r>
         <w:rPr>
           <w:rFonts w:ascii="Calibri" w:hAnsi="Calibri"/>
-          <w:color w:val="222222"/>
+          <w:sz w:val="21"/>
+        </w:rPr>
+        <w:t>40817810600001235840</w:t>
+      </w:r>
+    </w:p>
+    <w:p>
+      <w:pPr>
+        <w:spacing w:before="60" w:after="40"/>
+      </w:pPr>
+      <w:r>
+        <w:rPr>
+          <w:rFonts w:ascii="Calibri" w:hAnsi="Calibri"/>
+          <w:b/>
+          <w:color w:val="1F4E5B"/>
+          <w:sz w:val="21"/>
+        </w:rPr>
+        <w:t xml:space="preserve">Банк получателя: </w:t>
+      </w:r>
+      <w:r>
+        <w:rPr>
+          <w:rFonts w:ascii="Calibri" w:hAnsi="Calibri"/>
+          <w:sz w:val="21"/>
+        </w:rPr>
+        <w:t>ООО «ОЗОН БАНК» (ОБЩЕСТВО С ОГРАНИЧЕННОЙ ОТВЕТСТВЕННОСТЬЮ «ОЗОН БАНК»)</w:t>
+      </w:r>
+    </w:p>
+    <w:p>
+      <w:pPr>
+        <w:spacing w:before="60" w:after="40"/>
+      </w:pPr>
+      <w:r>
+        <w:rPr>
+          <w:rFonts w:ascii="Calibri" w:hAnsi="Calibri"/>
+          <w:b/>
+          <w:color w:val="1F4E5B"/>
+          <w:sz w:val="21"/>
+        </w:rPr>
+        <w:t xml:space="preserve">БИК банка: </w:t>
+      </w:r>
+      <w:r>
+        <w:rPr>
+          <w:rFonts w:ascii="Calibri" w:hAnsi="Calibri"/>
+          <w:sz w:val="21"/>
+        </w:rPr>
+        <w:t>044525068</w:t>
+      </w:r>
+    </w:p>
+    <w:p>
+      <w:pPr>
+        <w:spacing w:before="60" w:after="40"/>
+      </w:pPr>
+      <w:r>
+        <w:rPr>
+          <w:rFonts w:ascii="Calibri" w:hAnsi="Calibri"/>
+          <w:b/>
+          <w:color w:val="1F4E5B"/>
+          <w:sz w:val="21"/>
+        </w:rPr>
+        <w:t xml:space="preserve">Корреспондентский счёт: </w:t>
+      </w:r>
+      <w:r>
+        <w:rPr>
+          <w:rFonts w:ascii="Calibri" w:hAnsi="Calibri"/>
+          <w:sz w:val="21"/>
+        </w:rPr>
+        <w:t>30101810645374525068</w:t>
+      </w:r>
+    </w:p>
+    <w:p>
+      <w:pPr>
+        <w:spacing w:before="60" w:after="40"/>
+      </w:pPr>
+      <w:r>
+        <w:rPr>
+          <w:rFonts w:ascii="Calibri" w:hAnsi="Calibri"/>
+          <w:b/>
+          <w:color w:val="1F4E5B"/>
+          <w:sz w:val="21"/>
+        </w:rPr>
+        <w:t xml:space="preserve">ИНН банка: </w:t>
+      </w:r>
+      <w:r>
+        <w:rPr>
+          <w:rFonts w:ascii="Calibri" w:hAnsi="Calibri"/>
+          <w:sz w:val="21"/>
+        </w:rPr>
+        <w:t>9703077050</w:t>
+      </w:r>
+    </w:p>
+    <w:p>
+      <w:pPr>
+        <w:spacing w:before="60" w:after="40"/>
+      </w:pPr>
+      <w:r>
+        <w:rPr>
+          <w:rFonts w:ascii="Calibri" w:hAnsi="Calibri"/>
+          <w:b/>
+          <w:color w:val="1F4E5B"/>
+          <w:sz w:val="21"/>
+        </w:rPr>
+        <w:t xml:space="preserve">КПП банка: </w:t>
+      </w:r>
+      <w:r>
+        <w:rPr>
+          <w:rFonts w:ascii="Calibri" w:hAnsi="Calibri"/>
+          <w:sz w:val="21"/>
+        </w:rPr>
+        <w:t>770301001</w:t>
+      </w:r>
+    </w:p>
+    <w:p>
+      <w:pPr>
+        <w:spacing w:before="220" w:after="40"/>
+      </w:pPr>
+      <w:r>
+        <w:rPr>
+          <w:rFonts w:ascii="Calibri" w:hAnsi="Calibri"/>
+          <w:b/>
+          <w:color w:val="1F4E5B"/>
+          <w:sz w:val="24"/>
+        </w:rPr>
+        <w:t>3. КОНТАКТНЫЕ ДАННЫЕ</w:t>
+      </w:r>
+    </w:p>
+    <w:p>
+      <w:pPr>
+        <w:spacing w:before="60" w:after="40"/>
+      </w:pPr>
+      <w:r>
+        <w:rPr>
+          <w:rFonts w:ascii="Calibri" w:hAnsi="Calibri"/>
+          <w:b/>
+          <w:color w:val="1F4E5B"/>
+          <w:sz w:val="21"/>
+        </w:rPr>
+        <w:t xml:space="preserve">Официальный e-mail: </w:t>
+      </w:r>
+      <w:r>
+        <w:rPr>
+          <w:rFonts w:ascii="Calibri" w:hAnsi="Calibri"/>
           <w:sz w:val="21"/>
         </w:rPr>
         <w:t>tolikus@inbox.ru</w:t>
@@ -203,12 +321,11 @@
           <w:color w:val="1F4E5B"/>
           <w:sz w:val="21"/>
         </w:rPr>
-        <w:t xml:space="preserve">Telegram личный / рабочий: </w:t>
+        <w:t xml:space="preserve">Telegram для связи: </w:t>
       </w:r>
       <w:r>
         <w:rPr>
           <w:rFonts w:ascii="Calibri" w:hAnsi="Calibri"/>
-          <w:color w:val="222222"/>
           <w:sz w:val="21"/>
         </w:rPr>
         <w:t>https://t.me/luck_master (@luck_master)</w:t>
@@ -230,146 +347,9 @@
       <w:r>
         <w:rPr>
           <w:rFonts w:ascii="Calibri" w:hAnsi="Calibri"/>
-          <w:color w:val="222222"/>
           <w:sz w:val="21"/>
         </w:rPr>
-        <w:t>https://t.me/psyqst_bot (@psyqst_bot)</w:t>
-      </w:r>
-    </w:p>
-    <w:p>
-      <w:pPr>
-        <w:spacing w:before="60" w:after="40"/>
-      </w:pPr>
-      <w:r>
-        <w:rPr>
-          <w:rFonts w:ascii="Calibri" w:hAnsi="Calibri"/>
-          <w:b/>
-          <w:color w:val="1F4E5B"/>
-          <w:sz w:val="21"/>
-        </w:rPr>
-        <w:t xml:space="preserve">Канал проекта: </w:t>
-      </w:r>
-      <w:r>
-        <w:rPr>
-          <w:rFonts w:ascii="Calibri" w:hAnsi="Calibri"/>
-          <w:color w:val="222222"/>
-          <w:sz w:val="21"/>
-        </w:rPr>
-        <w:t>Telegram-канал «Простые вещи»</w:t>
-      </w:r>
-    </w:p>
-    <w:p>
-      <w:pPr>
-        <w:spacing w:before="200" w:after="40"/>
-      </w:pPr>
-      <w:r>
-        <w:rPr>
-          <w:rFonts w:ascii="Calibri" w:hAnsi="Calibri"/>
-          <w:b/>
-          <w:color w:val="1F4E5B"/>
-          <w:sz w:val="24"/>
-        </w:rPr>
-        <w:t>3. ПЛАТЕЖНЫЕ И ТЕХНИЧЕСКИЕ ПАРАМЕТРЫ</w:t>
-      </w:r>
-    </w:p>
-    <w:p>
-      <w:pPr>
-        <w:spacing w:before="60" w:after="40"/>
-      </w:pPr>
-      <w:r>
-        <w:rPr>
-          <w:rFonts w:ascii="Calibri" w:hAnsi="Calibri"/>
-          <w:b/>
-          <w:color w:val="1F4E5B"/>
-          <w:sz w:val="21"/>
-        </w:rPr>
-        <w:t xml:space="preserve">Форма расчетов: </w:t>
-      </w:r>
-      <w:r>
-        <w:rPr>
-          <w:rFonts w:ascii="Calibri" w:hAnsi="Calibri"/>
-          <w:color w:val="222222"/>
-          <w:sz w:val="21"/>
-        </w:rPr>
-        <w:t>Безналичный расчет (интернет-эквайринг, СБП, банковские карты РФ и зарубежные)</w:t>
-      </w:r>
-    </w:p>
-    <w:p>
-      <w:pPr>
-        <w:spacing w:before="60" w:after="40"/>
-      </w:pPr>
-      <w:r>
-        <w:rPr>
-          <w:rFonts w:ascii="Calibri" w:hAnsi="Calibri"/>
-          <w:b/>
-          <w:color w:val="1F4E5B"/>
-          <w:sz w:val="21"/>
-        </w:rPr>
-        <w:t xml:space="preserve">Уполномоченные платежные агрегаторы: </w:t>
-      </w:r>
-      <w:r>
-        <w:rPr>
-          <w:rFonts w:ascii="Calibri" w:hAnsi="Calibri"/>
-          <w:color w:val="222222"/>
-          <w:sz w:val="21"/>
-        </w:rPr>
-        <w:t>Robokassa (ООО «Бизнес Элемент»), Prodamus, ЮKassa и др.</w:t>
-      </w:r>
-    </w:p>
-    <w:p>
-      <w:pPr>
-        <w:spacing w:before="60" w:after="40"/>
-      </w:pPr>
-      <w:r>
-        <w:rPr>
-          <w:rFonts w:ascii="Calibri" w:hAnsi="Calibri"/>
-          <w:b/>
-          <w:color w:val="1F4E5B"/>
-          <w:sz w:val="21"/>
-        </w:rPr>
-        <w:t xml:space="preserve">Формирование фискальных чеков: </w:t>
-      </w:r>
-      <w:r>
-        <w:rPr>
-          <w:rFonts w:ascii="Calibri" w:hAnsi="Calibri"/>
-          <w:color w:val="222222"/>
-          <w:sz w:val="21"/>
-        </w:rPr>
-        <w:t>Автоматически через сервис «Мой налог» ФНС России и платежный шлюз</w:t>
-      </w:r>
-    </w:p>
-    <w:p>
-      <w:pPr>
-        <w:spacing w:before="200" w:after="40"/>
-      </w:pPr>
-      <w:r>
-        <w:rPr>
-          <w:rFonts w:ascii="Calibri" w:hAnsi="Calibri"/>
-          <w:b/>
-          <w:color w:val="1F4E5B"/>
-          <w:sz w:val="24"/>
-        </w:rPr>
-        <w:t>4. ДЛЯ ПОДВАЛА САЙТА / NOTIBOT / WEBAPP (КОПИРОВАТЬ В 1 КЛИК):</w:t>
-      </w:r>
-    </w:p>
-    <w:p>
-      <w:pPr>
-        <w:spacing w:before="120"/>
-      </w:pPr>
-      <w:r>
-        <w:rPr>
-          <w:rFonts w:ascii="Calibri" w:hAnsi="Calibri"/>
-          <w:i/>
-          <w:color w:val="444444"/>
-          <w:sz w:val="19"/>
-        </w:rPr>
-        <w:t>© 2026 Федоров Анатолий Игоревич</w:t>
-        <w:br/>
-        <w:t>ИНН 164803784216 | Самозанятый (НПД)</w:t>
-        <w:br/>
-        <w:t>Служба заботы и поддержка: tolikus@inbox.ru | Telegram: @luck_master</w:t>
-        <w:br/>
-        <w:t>Все права защищены.</w:t>
+        <w:t>https://t.me/psyqst_bot</w:t>
       </w:r>
     </w:p>
     <w:sectPr>

</xml_diff>